<commit_message>
le di a todo
</commit_message>
<xml_diff>
--- a/Proyecto de Graduacion 1/primera idea.docx
+++ b/Proyecto de Graduacion 1/primera idea.docx
@@ -315,7 +315,21 @@
         <w:rPr>
           <w:rFonts w:ascii="Times New Roman" w:hAnsi="Times New Roman" w:cs="Times New Roman"/>
         </w:rPr>
-        <w:t>Con la llegada del siglo XXI, el negocio inmobiliario ha experimentado una revolución gracias a la tecnología. Con la llegada de Internet y la digitalización de los procesos inmobiliarios. Durante la década de 1990, surgieron los primeros portales en línea, como Realtor.com (1995) y Zillow (2006), que permitieron a los compradores y vendedores acceder a listados de propiedades de manera más eficiente. La digitalización ha permitido que los compradores y vendedores accedan a plataformas en línea para buscar propiedades, realizar transacciones y obtener financiamiento de manera más eficiente.</w:t>
+        <w:t xml:space="preserve">Con la llegada del siglo XXI, el negocio inmobiliario ha experimentado una revolución gracias a la tecnología. Con la llegada de Internet y la digitalización de los procesos inmobiliarios. Durante la década de 1990, surgieron los primeros portales en línea, como Realtor.com (1995) y </w:t>
+      </w:r>
+      <w:proofErr w:type="spellStart"/>
+      <w:r>
+        <w:rPr>
+          <w:rFonts w:ascii="Times New Roman" w:hAnsi="Times New Roman" w:cs="Times New Roman"/>
+        </w:rPr>
+        <w:t>Zillow</w:t>
+      </w:r>
+      <w:proofErr w:type="spellEnd"/>
+      <w:r>
+        <w:rPr>
+          <w:rFonts w:ascii="Times New Roman" w:hAnsi="Times New Roman" w:cs="Times New Roman"/>
+        </w:rPr>
+        <w:t xml:space="preserve"> (2006), que permitieron a los compradores y vendedores acceder a listados de propiedades de manera más eficiente. La digitalización ha permitido que los compradores y vendedores accedan a plataformas en línea para buscar propiedades, realizar transacciones y obtener financiamiento de manera más eficiente.</w:t>
       </w:r>
     </w:p>
     <w:p>
@@ -331,7 +345,21 @@
         <w:rPr>
           <w:rFonts w:ascii="Times New Roman" w:hAnsi="Times New Roman" w:cs="Times New Roman"/>
         </w:rPr>
-        <w:t xml:space="preserve">Las innovaciones tecnológicas como la inteligencia artificial y el blockchain han transformado la industria, haciendo que los procesos sean más transparentes y accesibles. Además, el crecimiento de plataformas de alquiler a corto plazo, como Airbnb, ha redefinido el mercado de </w:t>
+        <w:t xml:space="preserve">Las innovaciones tecnológicas como la inteligencia artificial y el </w:t>
+      </w:r>
+      <w:proofErr w:type="spellStart"/>
+      <w:r>
+        <w:rPr>
+          <w:rFonts w:ascii="Times New Roman" w:hAnsi="Times New Roman" w:cs="Times New Roman"/>
+        </w:rPr>
+        <w:t>blockchain</w:t>
+      </w:r>
+      <w:proofErr w:type="spellEnd"/>
+      <w:r>
+        <w:rPr>
+          <w:rFonts w:ascii="Times New Roman" w:hAnsi="Times New Roman" w:cs="Times New Roman"/>
+        </w:rPr>
+        <w:t xml:space="preserve"> han transformado la industria, haciendo que los procesos sean más transparentes y accesibles. Además, el crecimiento de plataformas de alquiler a corto plazo, como Airbnb, ha redefinido el mercado de </w:t>
       </w:r>
       <w:r>
         <w:rPr>
@@ -992,6 +1020,54 @@
     <w:p>
       <w:pPr>
         <w:spacing w:line="480" w:lineRule="auto"/>
+        <w:jc w:val="both"/>
+        <w:rPr>
+          <w:rFonts w:ascii="Times New Roman" w:hAnsi="Times New Roman" w:cs="Times New Roman"/>
+        </w:rPr>
+      </w:pPr>
+      <w:r>
+        <w:rPr>
+          <w:rFonts w:ascii="Times New Roman" w:hAnsi="Times New Roman" w:cs="Times New Roman"/>
+        </w:rPr>
+        <w:t>La implementación de una plataforma digital especializada en la compra y alquiler de bienes raíces representa una oportunidad viable dentro del mercado inmobiliario guatemalteco, ya que responde a la creciente demanda de soluciones tecnológicas que agilicen las transacciones inmobiliarias. Este sistema permitirá modernizar la forma en que compradores, vendedores y agentes interactúan, mejorando los tiempos de respuesta y reduciendo la dependencia de intermediarios tradicionales.</w:t>
+      </w:r>
+      <w:r>
+        <w:rPr>
+          <w:rFonts w:ascii="Times New Roman" w:hAnsi="Times New Roman" w:cs="Times New Roman"/>
+        </w:rPr>
+        <w:br/>
+        <w:t xml:space="preserve">El mercado objetivo incluye tanto a particulares interesados en adquirir o alquilar propiedades como a pequeños y medianos negocios inmobiliarios que buscan herramientas eficientes para </w:t>
+      </w:r>
+      <w:r>
+        <w:rPr>
+          <w:rFonts w:ascii="Times New Roman" w:hAnsi="Times New Roman" w:cs="Times New Roman"/>
+        </w:rPr>
+        <w:lastRenderedPageBreak/>
+        <w:t>publicar, administrar y promocionar sus inmuebles. Además, la tendencia creciente hacia el uso de plataformas en línea para la búsqueda de viviendas y espacios comerciales demuestra un contexto favorable para la adopción de esta solución, en especial en zonas urbanas donde la digitalización avanza rápidamente. La plataforma</w:t>
+      </w:r>
+      <w:r>
+        <w:rPr>
+          <w:rFonts w:ascii="Times New Roman" w:hAnsi="Times New Roman" w:cs="Times New Roman"/>
+        </w:rPr>
+        <w:t xml:space="preserve"> </w:t>
+      </w:r>
+      <w:r>
+        <w:rPr>
+          <w:rFonts w:ascii="Times New Roman" w:hAnsi="Times New Roman" w:cs="Times New Roman"/>
+        </w:rPr>
+        <w:t xml:space="preserve">tiene el potencial de consolidarse como una alternativa </w:t>
+      </w:r>
+      <w:r>
+        <w:rPr>
+          <w:rFonts w:ascii="Times New Roman" w:hAnsi="Times New Roman" w:cs="Times New Roman"/>
+        </w:rPr>
+        <w:t>competitiva dentro del mercado local.</w:t>
+      </w:r>
+    </w:p>
+    <w:p>
+      <w:pPr>
+        <w:spacing w:line="480" w:lineRule="auto"/>
+        <w:jc w:val="both"/>
         <w:rPr>
           <w:rFonts w:ascii="Times New Roman" w:hAnsi="Times New Roman" w:cs="Times New Roman"/>
           <w:b/>
@@ -1001,780 +1077,661 @@
       <w:r>
         <w:rPr>
           <w:rFonts w:ascii="Times New Roman" w:hAnsi="Times New Roman" w:cs="Times New Roman"/>
-        </w:rPr>
-        <w:t>El mercado inmobiliario de Guatemala está en pleno crecimiento y se proyecta que movilice más de US$1,300 millones para 2028. Según datos recientes, se espera que el sector experimente una tasa de crecimiento anual del 5,59% entre 2024 y 2028, lo que representa una oportunidad importante tanto para compradores como para inversionistas.</w:t>
-      </w:r>
-    </w:p>
-    <w:p>
-      <w:pPr>
-        <w:spacing w:line="480" w:lineRule="auto"/>
-        <w:jc w:val="both"/>
-        <w:rPr>
-          <w:rFonts w:ascii="Times New Roman" w:hAnsi="Times New Roman" w:cs="Times New Roman"/>
-        </w:rPr>
-      </w:pPr>
-      <w:r>
-        <w:rPr>
-          <w:rFonts w:ascii="Times New Roman" w:hAnsi="Times New Roman" w:cs="Times New Roman"/>
-        </w:rPr>
-        <w:t>E</w:t>
-      </w:r>
-      <w:r>
-        <w:rPr>
-          <w:rFonts w:ascii="Times New Roman" w:hAnsi="Times New Roman" w:cs="Times New Roman"/>
-        </w:rPr>
-        <w:t xml:space="preserve">ste proyecto busca aprovechar esta oportunidad de mercado al desarrollar una aplicación web especializada que ofrezca una alternativa eficiente, accesible y segura para compradores y </w:t>
-      </w:r>
-      <w:r>
-        <w:rPr>
-          <w:rFonts w:ascii="Times New Roman" w:hAnsi="Times New Roman" w:cs="Times New Roman"/>
-        </w:rPr>
-        <w:lastRenderedPageBreak/>
-        <w:t>vendedores.</w:t>
-      </w:r>
-      <w:r>
-        <w:rPr>
-          <w:rFonts w:ascii="Times New Roman" w:hAnsi="Times New Roman" w:cs="Times New Roman"/>
-        </w:rPr>
-        <w:t xml:space="preserve"> S</w:t>
-      </w:r>
-      <w:r>
-        <w:rPr>
-          <w:rFonts w:ascii="Times New Roman" w:hAnsi="Times New Roman" w:cs="Times New Roman"/>
-        </w:rPr>
-        <w:t>e busca mejorar la experiencia del usuario y aumentar la confianza en l</w:t>
-      </w:r>
-      <w:r>
-        <w:rPr>
-          <w:rFonts w:ascii="Times New Roman" w:hAnsi="Times New Roman" w:cs="Times New Roman"/>
-        </w:rPr>
-        <w:t>o</w:t>
-      </w:r>
-      <w:r>
-        <w:rPr>
-          <w:rFonts w:ascii="Times New Roman" w:hAnsi="Times New Roman" w:cs="Times New Roman"/>
-        </w:rPr>
-        <w:t xml:space="preserve">s </w:t>
-      </w:r>
-      <w:r>
-        <w:rPr>
-          <w:rFonts w:ascii="Times New Roman" w:hAnsi="Times New Roman" w:cs="Times New Roman"/>
-        </w:rPr>
-        <w:t>procesos de adquisiciones</w:t>
-      </w:r>
-      <w:r>
-        <w:rPr>
-          <w:rFonts w:ascii="Times New Roman" w:hAnsi="Times New Roman" w:cs="Times New Roman"/>
-        </w:rPr>
-        <w:t xml:space="preserve"> inmobiliarias.</w:t>
-      </w:r>
-    </w:p>
-    <w:p>
-      <w:pPr>
-        <w:spacing w:line="480" w:lineRule="auto"/>
-        <w:jc w:val="both"/>
-        <w:rPr>
-          <w:rFonts w:ascii="Times New Roman" w:hAnsi="Times New Roman" w:cs="Times New Roman"/>
-        </w:rPr>
-      </w:pPr>
-      <w:r>
-        <w:rPr>
-          <w:rFonts w:ascii="Times New Roman" w:hAnsi="Times New Roman" w:cs="Times New Roman"/>
-        </w:rPr>
-        <w:t>Además, el aumento del acceso a internet y el uso de dispositivos móviles facilita la adopción de este tipo de plataformas, lo que indica un mercado potencial en constante expansión. La creciente necesidad de digitalización en el sector inmobiliario respalda la viabilidad comercial del proyecto.</w:t>
-      </w:r>
-    </w:p>
-    <w:p>
-      <w:pPr>
-        <w:spacing w:line="480" w:lineRule="auto"/>
-        <w:jc w:val="both"/>
-        <w:rPr>
-          <w:rFonts w:ascii="Times New Roman" w:hAnsi="Times New Roman" w:cs="Times New Roman"/>
           <w:b/>
           <w:bCs/>
         </w:rPr>
-      </w:pPr>
+        <w:t xml:space="preserve">Viabilidad </w:t>
+      </w:r>
       <w:r>
         <w:rPr>
           <w:rFonts w:ascii="Times New Roman" w:hAnsi="Times New Roman" w:cs="Times New Roman"/>
           <w:b/>
           <w:bCs/>
         </w:rPr>
-        <w:t xml:space="preserve">Viabilidad </w:t>
-      </w:r>
-      <w:r>
+        <w:t>soporte:</w:t>
+      </w:r>
+    </w:p>
+    <w:p>
+      <w:pPr>
+        <w:spacing w:line="480" w:lineRule="auto"/>
+        <w:jc w:val="both"/>
+        <w:rPr>
+          <w:rFonts w:ascii="Times New Roman" w:hAnsi="Times New Roman" w:cs="Times New Roman"/>
+        </w:rPr>
+      </w:pPr>
+      <w:r>
+        <w:rPr>
+          <w:rFonts w:ascii="Times New Roman" w:hAnsi="Times New Roman" w:cs="Times New Roman"/>
+        </w:rPr>
+        <w:t>La plataforma contará con soporte técnico continuo para garantizar su operatividad y funcionalidad. Se implementarán mecanismos de monitoreo para detectar posibles fallos, así como actualizaciones periódicas orientadas a mejorar la experiencia del usuario y la seguridad del sistema. Además, se brindará capacitación a los usuarios clave, como administradores y agentes inmobiliarios, para asegurar un manejo adecuado de la plataforma y reducir la incidencia de problemas operativos.</w:t>
+      </w:r>
+    </w:p>
+    <w:p>
+      <w:pPr>
+        <w:spacing w:line="480" w:lineRule="auto"/>
+        <w:jc w:val="both"/>
         <w:rPr>
           <w:rFonts w:ascii="Times New Roman" w:hAnsi="Times New Roman" w:cs="Times New Roman"/>
           <w:b/>
           <w:bCs/>
         </w:rPr>
-        <w:t>soporte:</w:t>
-      </w:r>
-    </w:p>
-    <w:p>
-      <w:pPr>
-        <w:spacing w:line="480" w:lineRule="auto"/>
-        <w:jc w:val="both"/>
-        <w:rPr>
-          <w:rFonts w:ascii="Times New Roman" w:hAnsi="Times New Roman" w:cs="Times New Roman"/>
-        </w:rPr>
-      </w:pPr>
-      <w:r>
-        <w:rPr>
-          <w:rFonts w:ascii="Times New Roman" w:hAnsi="Times New Roman" w:cs="Times New Roman"/>
-        </w:rPr>
-        <w:t>El desarrollo de esta plataforma contará</w:t>
-      </w:r>
-      <w:r>
-        <w:rPr>
-          <w:rFonts w:ascii="Times New Roman" w:hAnsi="Times New Roman" w:cs="Times New Roman"/>
-        </w:rPr>
-        <w:t xml:space="preserve"> </w:t>
-      </w:r>
-      <w:r>
-        <w:rPr>
-          <w:rFonts w:ascii="Times New Roman" w:hAnsi="Times New Roman" w:cs="Times New Roman"/>
-        </w:rPr>
-        <w:t>con mi respaldo como desarrollador</w:t>
-      </w:r>
-      <w:r>
-        <w:rPr>
-          <w:rFonts w:ascii="Times New Roman" w:hAnsi="Times New Roman" w:cs="Times New Roman"/>
-        </w:rPr>
-        <w:t>,</w:t>
-      </w:r>
-      <w:r>
-        <w:rPr>
-          <w:rFonts w:ascii="Times New Roman" w:hAnsi="Times New Roman" w:cs="Times New Roman"/>
-        </w:rPr>
-        <w:t xml:space="preserve"> mi experiencia y compromiso</w:t>
-      </w:r>
-      <w:r>
-        <w:rPr>
-          <w:rFonts w:ascii="Times New Roman" w:hAnsi="Times New Roman" w:cs="Times New Roman"/>
-        </w:rPr>
-        <w:t xml:space="preserve"> asegura</w:t>
-      </w:r>
-      <w:r>
-        <w:rPr>
-          <w:rFonts w:ascii="Times New Roman" w:hAnsi="Times New Roman" w:cs="Times New Roman"/>
-        </w:rPr>
-        <w:t>ran</w:t>
-      </w:r>
-      <w:r>
-        <w:rPr>
-          <w:rFonts w:ascii="Times New Roman" w:hAnsi="Times New Roman" w:cs="Times New Roman"/>
-        </w:rPr>
-        <w:t xml:space="preserve"> que la aplicación sea escalable y confiable. Además, se establecerán estrategias de soporte técnico para garantizar el mantenimiento continuo del sistema y la resolución rápida de posibles fallos</w:t>
-      </w:r>
-      <w:r>
-        <w:rPr>
-          <w:rFonts w:ascii="Times New Roman" w:hAnsi="Times New Roman" w:cs="Times New Roman"/>
-        </w:rPr>
-        <w:t xml:space="preserve"> garantizando su efectividad</w:t>
-      </w:r>
-      <w:r>
-        <w:rPr>
-          <w:rFonts w:ascii="Times New Roman" w:hAnsi="Times New Roman" w:cs="Times New Roman"/>
-        </w:rPr>
-        <w:t>.</w:t>
-      </w:r>
-    </w:p>
-    <w:p>
-      <w:pPr>
-        <w:spacing w:line="480" w:lineRule="auto"/>
-        <w:jc w:val="both"/>
+      </w:pPr>
+      <w:r>
         <w:rPr>
           <w:rFonts w:ascii="Times New Roman" w:hAnsi="Times New Roman" w:cs="Times New Roman"/>
           <w:b/>
           <w:bCs/>
         </w:rPr>
-      </w:pPr>
-      <w:r>
+        <w:t>Viabilidad técnica:</w:t>
+      </w:r>
+    </w:p>
+    <w:p>
+      <w:pPr>
+        <w:spacing w:line="480" w:lineRule="auto"/>
+        <w:jc w:val="both"/>
+        <w:rPr>
+          <w:rFonts w:ascii="Times New Roman" w:hAnsi="Times New Roman" w:cs="Times New Roman"/>
+        </w:rPr>
+      </w:pPr>
+      <w:r>
+        <w:rPr>
+          <w:rFonts w:ascii="Times New Roman" w:hAnsi="Times New Roman" w:cs="Times New Roman"/>
+        </w:rPr>
+        <w:t xml:space="preserve">El desarrollo de </w:t>
+      </w:r>
+      <w:r>
+        <w:rPr>
+          <w:rFonts w:ascii="Times New Roman" w:hAnsi="Times New Roman" w:cs="Times New Roman"/>
+        </w:rPr>
+        <w:t>esta</w:t>
+      </w:r>
+      <w:r>
+        <w:rPr>
+          <w:rFonts w:ascii="Times New Roman" w:hAnsi="Times New Roman" w:cs="Times New Roman"/>
+        </w:rPr>
+        <w:t xml:space="preserve"> aplicación web es técnicamente viable gracias a tecnologías modernas y accesibles.</w:t>
+      </w:r>
+      <w:r>
+        <w:rPr>
+          <w:rFonts w:ascii="Times New Roman" w:hAnsi="Times New Roman" w:cs="Times New Roman"/>
+        </w:rPr>
+        <w:t xml:space="preserve"> Existen varias</w:t>
+      </w:r>
+      <w:r>
+        <w:rPr>
+          <w:rFonts w:ascii="Times New Roman" w:hAnsi="Times New Roman" w:cs="Times New Roman"/>
+        </w:rPr>
+        <w:t xml:space="preserve"> </w:t>
+      </w:r>
+      <w:r>
+        <w:rPr>
+          <w:rFonts w:ascii="Times New Roman" w:hAnsi="Times New Roman" w:cs="Times New Roman"/>
+        </w:rPr>
+        <w:t>h</w:t>
+      </w:r>
+      <w:r>
+        <w:rPr>
+          <w:rFonts w:ascii="Times New Roman" w:hAnsi="Times New Roman" w:cs="Times New Roman"/>
+        </w:rPr>
+        <w:t>erramientas</w:t>
+      </w:r>
+      <w:r>
+        <w:rPr>
+          <w:rFonts w:ascii="Times New Roman" w:hAnsi="Times New Roman" w:cs="Times New Roman"/>
+        </w:rPr>
+        <w:t xml:space="preserve"> </w:t>
+      </w:r>
+      <w:r>
+        <w:rPr>
+          <w:rFonts w:ascii="Times New Roman" w:hAnsi="Times New Roman" w:cs="Times New Roman"/>
+        </w:rPr>
+        <w:t>permiten crear interfaces dinámicas y responsivas.</w:t>
+      </w:r>
+      <w:r>
+        <w:rPr>
+          <w:rFonts w:ascii="Times New Roman" w:hAnsi="Times New Roman" w:cs="Times New Roman"/>
+        </w:rPr>
+        <w:t xml:space="preserve"> Gestores de</w:t>
+      </w:r>
+      <w:r>
+        <w:rPr>
+          <w:rFonts w:ascii="Times New Roman" w:hAnsi="Times New Roman" w:cs="Times New Roman"/>
+        </w:rPr>
+        <w:t xml:space="preserve"> </w:t>
+      </w:r>
+      <w:r>
+        <w:rPr>
+          <w:rFonts w:ascii="Times New Roman" w:hAnsi="Times New Roman" w:cs="Times New Roman"/>
+        </w:rPr>
+        <w:t>b</w:t>
+      </w:r>
+      <w:r>
+        <w:rPr>
+          <w:rFonts w:ascii="Times New Roman" w:hAnsi="Times New Roman" w:cs="Times New Roman"/>
+        </w:rPr>
+        <w:t>ases de datos</w:t>
+      </w:r>
+      <w:r>
+        <w:rPr>
+          <w:rFonts w:ascii="Times New Roman" w:hAnsi="Times New Roman" w:cs="Times New Roman"/>
+        </w:rPr>
+        <w:t xml:space="preserve"> que</w:t>
+      </w:r>
+      <w:r>
+        <w:rPr>
+          <w:rFonts w:ascii="Times New Roman" w:hAnsi="Times New Roman" w:cs="Times New Roman"/>
+        </w:rPr>
+        <w:t xml:space="preserve"> garantizan un manejo eficiente de la información de propiedades y usuarios.</w:t>
+      </w:r>
+    </w:p>
+    <w:p>
+      <w:pPr>
+        <w:spacing w:line="480" w:lineRule="auto"/>
+        <w:jc w:val="both"/>
         <w:rPr>
           <w:rFonts w:ascii="Times New Roman" w:hAnsi="Times New Roman" w:cs="Times New Roman"/>
           <w:b/>
           <w:bCs/>
         </w:rPr>
-        <w:t>Viabilidad técnica:</w:t>
-      </w:r>
-    </w:p>
-    <w:p>
-      <w:pPr>
-        <w:spacing w:line="480" w:lineRule="auto"/>
-        <w:jc w:val="both"/>
-        <w:rPr>
-          <w:rFonts w:ascii="Times New Roman" w:hAnsi="Times New Roman" w:cs="Times New Roman"/>
-        </w:rPr>
-      </w:pPr>
-      <w:r>
-        <w:rPr>
-          <w:rFonts w:ascii="Times New Roman" w:hAnsi="Times New Roman" w:cs="Times New Roman"/>
-        </w:rPr>
-        <w:t>El desarrollo de una aplicación web de bienes raíces es técnicamente viable gracias a tecnologías modernas y accesibles.</w:t>
-      </w:r>
-      <w:r>
-        <w:rPr>
-          <w:rFonts w:ascii="Times New Roman" w:hAnsi="Times New Roman" w:cs="Times New Roman"/>
-        </w:rPr>
-        <w:t xml:space="preserve"> Existen varias</w:t>
-      </w:r>
-      <w:r>
-        <w:rPr>
-          <w:rFonts w:ascii="Times New Roman" w:hAnsi="Times New Roman" w:cs="Times New Roman"/>
-        </w:rPr>
-        <w:t xml:space="preserve"> </w:t>
-      </w:r>
-      <w:r>
-        <w:rPr>
-          <w:rFonts w:ascii="Times New Roman" w:hAnsi="Times New Roman" w:cs="Times New Roman"/>
-        </w:rPr>
-        <w:t>h</w:t>
-      </w:r>
-      <w:r>
-        <w:rPr>
-          <w:rFonts w:ascii="Times New Roman" w:hAnsi="Times New Roman" w:cs="Times New Roman"/>
-        </w:rPr>
-        <w:t>erramientas</w:t>
-      </w:r>
-      <w:r>
-        <w:rPr>
-          <w:rFonts w:ascii="Times New Roman" w:hAnsi="Times New Roman" w:cs="Times New Roman"/>
-        </w:rPr>
-        <w:t xml:space="preserve"> </w:t>
-      </w:r>
-      <w:r>
-        <w:rPr>
-          <w:rFonts w:ascii="Times New Roman" w:hAnsi="Times New Roman" w:cs="Times New Roman"/>
-        </w:rPr>
-        <w:t>permiten crear interfaces dinámicas y responsivas.</w:t>
-      </w:r>
-      <w:r>
-        <w:rPr>
-          <w:rFonts w:ascii="Times New Roman" w:hAnsi="Times New Roman" w:cs="Times New Roman"/>
-        </w:rPr>
-        <w:t xml:space="preserve"> Gestores de</w:t>
-      </w:r>
-      <w:r>
-        <w:rPr>
-          <w:rFonts w:ascii="Times New Roman" w:hAnsi="Times New Roman" w:cs="Times New Roman"/>
-        </w:rPr>
-        <w:t xml:space="preserve"> </w:t>
-      </w:r>
-      <w:r>
-        <w:rPr>
-          <w:rFonts w:ascii="Times New Roman" w:hAnsi="Times New Roman" w:cs="Times New Roman"/>
-        </w:rPr>
-        <w:t>b</w:t>
-      </w:r>
-      <w:r>
-        <w:rPr>
-          <w:rFonts w:ascii="Times New Roman" w:hAnsi="Times New Roman" w:cs="Times New Roman"/>
-        </w:rPr>
-        <w:t>ases de datos</w:t>
-      </w:r>
-      <w:r>
-        <w:rPr>
-          <w:rFonts w:ascii="Times New Roman" w:hAnsi="Times New Roman" w:cs="Times New Roman"/>
-        </w:rPr>
-        <w:t xml:space="preserve"> que</w:t>
-      </w:r>
-      <w:r>
-        <w:rPr>
-          <w:rFonts w:ascii="Times New Roman" w:hAnsi="Times New Roman" w:cs="Times New Roman"/>
-        </w:rPr>
-        <w:t xml:space="preserve"> garantizan un manejo eficiente de la información de propiedades y usuarios. Además, servicios en la nube ofrecen escalabilidad y seguridad.</w:t>
-      </w:r>
-    </w:p>
-    <w:p>
-      <w:pPr>
-        <w:spacing w:line="480" w:lineRule="auto"/>
-        <w:jc w:val="both"/>
+      </w:pPr>
+      <w:r>
         <w:rPr>
           <w:rFonts w:ascii="Times New Roman" w:hAnsi="Times New Roman" w:cs="Times New Roman"/>
           <w:b/>
           <w:bCs/>
         </w:rPr>
-      </w:pPr>
-      <w:r>
+        <w:t>Viabilidad administrativa:</w:t>
+      </w:r>
+    </w:p>
+    <w:p>
+      <w:pPr>
+        <w:spacing w:line="480" w:lineRule="auto"/>
+        <w:jc w:val="both"/>
+        <w:rPr>
+          <w:rFonts w:ascii="Times New Roman" w:hAnsi="Times New Roman" w:cs="Times New Roman"/>
+        </w:rPr>
+      </w:pPr>
+      <w:r>
+        <w:rPr>
+          <w:rFonts w:ascii="Times New Roman" w:hAnsi="Times New Roman" w:cs="Times New Roman"/>
+        </w:rPr>
+        <w:t>El proyecto contará con el respaldo necesario para su ejecución, mediante la planificación adecuada de recursos humanos y técnicos que permitan desarrollar la plataforma según los requerimientos establecidos. Se validarán los procesos propuestos</w:t>
+      </w:r>
+      <w:r>
+        <w:rPr>
+          <w:rFonts w:ascii="Times New Roman" w:hAnsi="Times New Roman" w:cs="Times New Roman"/>
+        </w:rPr>
+        <w:t xml:space="preserve"> </w:t>
+      </w:r>
+      <w:r>
+        <w:rPr>
+          <w:rFonts w:ascii="Times New Roman" w:hAnsi="Times New Roman" w:cs="Times New Roman"/>
+        </w:rPr>
+        <w:t xml:space="preserve">y se recopilará retroalimentación constante para garantizar que las funcionalidades respondan a las necesidades </w:t>
+      </w:r>
+      <w:r>
+        <w:rPr>
+          <w:rFonts w:ascii="Times New Roman" w:hAnsi="Times New Roman" w:cs="Times New Roman"/>
+        </w:rPr>
+        <w:lastRenderedPageBreak/>
+        <w:t xml:space="preserve">reales del mercado. </w:t>
+      </w:r>
+      <w:r>
+        <w:rPr>
+          <w:rFonts w:ascii="Times New Roman" w:hAnsi="Times New Roman" w:cs="Times New Roman"/>
+        </w:rPr>
+        <w:t>L</w:t>
+      </w:r>
+      <w:r>
+        <w:rPr>
+          <w:rFonts w:ascii="Times New Roman" w:hAnsi="Times New Roman" w:cs="Times New Roman"/>
+        </w:rPr>
+        <w:t>o que permitirá asegurar la sostenibilidad del sistema a largo plazo y su correcta administración.</w:t>
+      </w:r>
+    </w:p>
+    <w:p>
+      <w:pPr>
+        <w:spacing w:line="480" w:lineRule="auto"/>
+        <w:jc w:val="both"/>
+        <w:rPr>
+          <w:rFonts w:ascii="Times New Roman" w:hAnsi="Times New Roman" w:cs="Times New Roman"/>
+        </w:rPr>
+      </w:pPr>
+    </w:p>
+    <w:p>
+      <w:pPr>
+        <w:spacing w:line="480" w:lineRule="auto"/>
+        <w:jc w:val="center"/>
         <w:rPr>
           <w:rFonts w:ascii="Times New Roman" w:hAnsi="Times New Roman" w:cs="Times New Roman"/>
           <w:b/>
           <w:bCs/>
         </w:rPr>
-        <w:t>Viabilidad administrativa:</w:t>
-      </w:r>
-    </w:p>
-    <w:p>
-      <w:pPr>
-        <w:spacing w:line="480" w:lineRule="auto"/>
-        <w:jc w:val="both"/>
-        <w:rPr>
-          <w:rFonts w:ascii="Times New Roman" w:hAnsi="Times New Roman" w:cs="Times New Roman"/>
-        </w:rPr>
-      </w:pPr>
-      <w:r>
-        <w:rPr>
-          <w:rFonts w:ascii="Times New Roman" w:hAnsi="Times New Roman" w:cs="Times New Roman"/>
-        </w:rPr>
-        <w:t>Para la administración del proyecto, se establecerán roles y responsabilidades bien definidas dentro de</w:t>
-      </w:r>
-      <w:r>
-        <w:rPr>
-          <w:rFonts w:ascii="Times New Roman" w:hAnsi="Times New Roman" w:cs="Times New Roman"/>
-        </w:rPr>
-        <w:t xml:space="preserve"> un</w:t>
-      </w:r>
-      <w:r>
-        <w:rPr>
-          <w:rFonts w:ascii="Times New Roman" w:hAnsi="Times New Roman" w:cs="Times New Roman"/>
-        </w:rPr>
-        <w:t xml:space="preserve"> equipo de desarrollo, asegurando una gestión eficiente del tiempo y los recursos. Se utilizarán metodologías ágiles para el seguimiento del progreso y la entrega de funcionalidades en fases iterativas.</w:t>
-      </w:r>
-    </w:p>
-    <w:p>
-      <w:pPr>
-        <w:spacing w:line="480" w:lineRule="auto"/>
-        <w:jc w:val="both"/>
-        <w:rPr>
-          <w:rFonts w:ascii="Times New Roman" w:hAnsi="Times New Roman" w:cs="Times New Roman"/>
-        </w:rPr>
-      </w:pPr>
-      <w:r>
-        <w:rPr>
-          <w:rFonts w:ascii="Times New Roman" w:hAnsi="Times New Roman" w:cs="Times New Roman"/>
-        </w:rPr>
-        <w:lastRenderedPageBreak/>
-        <w:t>Se llevará a cabo una planificación financiera detallada para determinar los costos de desarrollo, implementación y mantenimiento de la plataforma, asegurando que el proyecto sea sostenible a largo plazo.</w:t>
-      </w:r>
-    </w:p>
-    <w:p>
-      <w:pPr>
-        <w:spacing w:line="480" w:lineRule="auto"/>
-        <w:jc w:val="both"/>
-        <w:rPr>
-          <w:rFonts w:ascii="Times New Roman" w:hAnsi="Times New Roman" w:cs="Times New Roman"/>
-        </w:rPr>
-      </w:pPr>
-    </w:p>
-    <w:p>
-      <w:pPr>
-        <w:spacing w:line="480" w:lineRule="auto"/>
-        <w:jc w:val="both"/>
-        <w:rPr>
-          <w:rFonts w:ascii="Times New Roman" w:hAnsi="Times New Roman" w:cs="Times New Roman"/>
-        </w:rPr>
-      </w:pPr>
-    </w:p>
-    <w:p>
-      <w:pPr>
-        <w:spacing w:line="480" w:lineRule="auto"/>
-        <w:jc w:val="center"/>
+      </w:pPr>
+      <w:r>
         <w:rPr>
           <w:rFonts w:ascii="Times New Roman" w:hAnsi="Times New Roman" w:cs="Times New Roman"/>
           <w:b/>
           <w:bCs/>
         </w:rPr>
-      </w:pPr>
-      <w:r>
+        <w:t>Alcances A</w:t>
+      </w:r>
+    </w:p>
+    <w:p>
+      <w:pPr>
+        <w:spacing w:line="480" w:lineRule="auto"/>
+        <w:jc w:val="both"/>
         <w:rPr>
           <w:rFonts w:ascii="Times New Roman" w:hAnsi="Times New Roman" w:cs="Times New Roman"/>
           <w:b/>
           <w:bCs/>
         </w:rPr>
-        <w:t>Alcances A</w:t>
-      </w:r>
-    </w:p>
-    <w:p>
-      <w:pPr>
-        <w:spacing w:line="480" w:lineRule="auto"/>
-        <w:jc w:val="both"/>
+      </w:pPr>
+      <w:r>
         <w:rPr>
           <w:rFonts w:ascii="Times New Roman" w:hAnsi="Times New Roman" w:cs="Times New Roman"/>
           <w:b/>
           <w:bCs/>
         </w:rPr>
-      </w:pPr>
-      <w:r>
+        <w:t>Geográfico:</w:t>
+      </w:r>
+    </w:p>
+    <w:p>
+      <w:pPr>
+        <w:spacing w:line="480" w:lineRule="auto"/>
+        <w:jc w:val="both"/>
+        <w:rPr>
+          <w:rFonts w:ascii="Times New Roman" w:hAnsi="Times New Roman" w:cs="Times New Roman"/>
+        </w:rPr>
+      </w:pPr>
+      <w:r>
+        <w:rPr>
+          <w:rFonts w:ascii="Times New Roman" w:hAnsi="Times New Roman" w:cs="Times New Roman"/>
+        </w:rPr>
+        <w:t>El proyecto</w:t>
+      </w:r>
+      <w:r>
+        <w:rPr>
+          <w:rFonts w:ascii="Times New Roman" w:hAnsi="Times New Roman" w:cs="Times New Roman"/>
+        </w:rPr>
+        <w:t xml:space="preserve"> para desarrollarse</w:t>
+      </w:r>
+      <w:r>
+        <w:rPr>
+          <w:rFonts w:ascii="Times New Roman" w:hAnsi="Times New Roman" w:cs="Times New Roman"/>
+        </w:rPr>
+        <w:t xml:space="preserve"> </w:t>
+      </w:r>
+      <w:r>
+        <w:rPr>
+          <w:rFonts w:ascii="Times New Roman" w:hAnsi="Times New Roman" w:cs="Times New Roman"/>
+          <w:lang w:val="es-ES"/>
+        </w:rPr>
+        <w:t>estará disponible</w:t>
+      </w:r>
+      <w:r>
+        <w:rPr>
+          <w:rFonts w:ascii="Times New Roman" w:hAnsi="Times New Roman" w:cs="Times New Roman"/>
+        </w:rPr>
+        <w:t xml:space="preserve"> a nivel nacional, permitiendo que </w:t>
+      </w:r>
+      <w:r>
+        <w:rPr>
+          <w:rFonts w:ascii="Times New Roman" w:hAnsi="Times New Roman" w:cs="Times New Roman"/>
+        </w:rPr>
+        <w:t>personas que busquen</w:t>
+      </w:r>
+      <w:r>
+        <w:rPr>
+          <w:rFonts w:ascii="Times New Roman" w:hAnsi="Times New Roman" w:cs="Times New Roman"/>
+        </w:rPr>
+        <w:t xml:space="preserve"> bienes raíces </w:t>
+      </w:r>
+      <w:r>
+        <w:rPr>
+          <w:rFonts w:ascii="Times New Roman" w:hAnsi="Times New Roman" w:cs="Times New Roman"/>
+        </w:rPr>
+        <w:t>en</w:t>
+      </w:r>
+      <w:r>
+        <w:rPr>
+          <w:rFonts w:ascii="Times New Roman" w:hAnsi="Times New Roman" w:cs="Times New Roman"/>
+        </w:rPr>
+        <w:t xml:space="preserve"> distintos departamentos y municipios puedan acceder a la plataforma.</w:t>
+      </w:r>
+      <w:r>
+        <w:rPr>
+          <w:rFonts w:ascii="Times New Roman" w:hAnsi="Times New Roman" w:cs="Times New Roman"/>
+          <w:lang w:val="es-ES"/>
+        </w:rPr>
+        <w:t xml:space="preserve"> </w:t>
+      </w:r>
+    </w:p>
+    <w:p>
+      <w:pPr>
+        <w:spacing w:line="480" w:lineRule="auto"/>
+        <w:jc w:val="both"/>
+        <w:rPr>
+          <w:rFonts w:ascii="Times New Roman" w:hAnsi="Times New Roman" w:cs="Times New Roman"/>
+        </w:rPr>
+      </w:pPr>
+    </w:p>
+    <w:p>
+      <w:pPr>
+        <w:spacing w:line="480" w:lineRule="auto"/>
+        <w:jc w:val="both"/>
         <w:rPr>
           <w:rFonts w:ascii="Times New Roman" w:hAnsi="Times New Roman" w:cs="Times New Roman"/>
           <w:b/>
           <w:bCs/>
         </w:rPr>
-        <w:t>Geográfico:</w:t>
-      </w:r>
-    </w:p>
-    <w:p>
-      <w:pPr>
-        <w:spacing w:line="480" w:lineRule="auto"/>
-        <w:jc w:val="both"/>
-        <w:rPr>
-          <w:rFonts w:ascii="Times New Roman" w:hAnsi="Times New Roman" w:cs="Times New Roman"/>
-        </w:rPr>
-      </w:pPr>
-      <w:r>
-        <w:rPr>
-          <w:rFonts w:ascii="Times New Roman" w:hAnsi="Times New Roman" w:cs="Times New Roman"/>
-        </w:rPr>
-        <w:t>El proyecto</w:t>
-      </w:r>
-      <w:r>
-        <w:rPr>
-          <w:rFonts w:ascii="Times New Roman" w:hAnsi="Times New Roman" w:cs="Times New Roman"/>
-        </w:rPr>
-        <w:t xml:space="preserve"> para desarrollarse</w:t>
-      </w:r>
-      <w:r>
-        <w:rPr>
-          <w:rFonts w:ascii="Times New Roman" w:hAnsi="Times New Roman" w:cs="Times New Roman"/>
-        </w:rPr>
-        <w:t xml:space="preserve"> </w:t>
-      </w:r>
-      <w:r>
-        <w:rPr>
-          <w:rFonts w:ascii="Times New Roman" w:hAnsi="Times New Roman" w:cs="Times New Roman"/>
-          <w:lang w:val="es-ES"/>
-        </w:rPr>
-        <w:t>estará disponible</w:t>
-      </w:r>
-      <w:r>
-        <w:rPr>
-          <w:rFonts w:ascii="Times New Roman" w:hAnsi="Times New Roman" w:cs="Times New Roman"/>
-        </w:rPr>
-        <w:t xml:space="preserve"> a nivel nacional, permitiendo que </w:t>
-      </w:r>
-      <w:r>
-        <w:rPr>
-          <w:rFonts w:ascii="Times New Roman" w:hAnsi="Times New Roman" w:cs="Times New Roman"/>
-        </w:rPr>
-        <w:t>personas que busquen</w:t>
-      </w:r>
-      <w:r>
-        <w:rPr>
-          <w:rFonts w:ascii="Times New Roman" w:hAnsi="Times New Roman" w:cs="Times New Roman"/>
-        </w:rPr>
-        <w:t xml:space="preserve"> bienes raíces </w:t>
-      </w:r>
-      <w:r>
-        <w:rPr>
-          <w:rFonts w:ascii="Times New Roman" w:hAnsi="Times New Roman" w:cs="Times New Roman"/>
-        </w:rPr>
-        <w:t>en</w:t>
-      </w:r>
-      <w:r>
-        <w:rPr>
-          <w:rFonts w:ascii="Times New Roman" w:hAnsi="Times New Roman" w:cs="Times New Roman"/>
-        </w:rPr>
-        <w:t xml:space="preserve"> distintos departamentos y municipios puedan acceder a la plataforma.</w:t>
-      </w:r>
-      <w:r>
-        <w:rPr>
-          <w:rFonts w:ascii="Times New Roman" w:hAnsi="Times New Roman" w:cs="Times New Roman"/>
-          <w:lang w:val="es-ES"/>
-        </w:rPr>
-        <w:t xml:space="preserve"> </w:t>
-      </w:r>
-    </w:p>
-    <w:p>
-      <w:pPr>
-        <w:spacing w:line="480" w:lineRule="auto"/>
-        <w:jc w:val="both"/>
-        <w:rPr>
-          <w:rFonts w:ascii="Times New Roman" w:hAnsi="Times New Roman" w:cs="Times New Roman"/>
-        </w:rPr>
-      </w:pPr>
-    </w:p>
-    <w:p>
-      <w:pPr>
-        <w:spacing w:line="480" w:lineRule="auto"/>
-        <w:jc w:val="both"/>
+      </w:pPr>
+      <w:r>
         <w:rPr>
           <w:rFonts w:ascii="Times New Roman" w:hAnsi="Times New Roman" w:cs="Times New Roman"/>
           <w:b/>
           <w:bCs/>
         </w:rPr>
-      </w:pPr>
-      <w:r>
+        <w:t>Institucional:</w:t>
+      </w:r>
+    </w:p>
+    <w:p>
+      <w:pPr>
+        <w:spacing w:line="480" w:lineRule="auto"/>
+        <w:jc w:val="both"/>
+        <w:rPr>
+          <w:rFonts w:ascii="Times New Roman" w:hAnsi="Times New Roman" w:cs="Times New Roman"/>
+        </w:rPr>
+      </w:pPr>
+      <w:r>
+        <w:rPr>
+          <w:rFonts w:ascii="Times New Roman" w:hAnsi="Times New Roman" w:cs="Times New Roman"/>
+        </w:rPr>
+        <w:t>Se trabajará en coordinación con agencias inmobiliarias</w:t>
+      </w:r>
+      <w:r>
+        <w:rPr>
+          <w:rFonts w:ascii="Times New Roman" w:hAnsi="Times New Roman" w:cs="Times New Roman"/>
+        </w:rPr>
+        <w:t xml:space="preserve"> </w:t>
+      </w:r>
+      <w:r>
+        <w:rPr>
+          <w:rFonts w:ascii="Times New Roman" w:hAnsi="Times New Roman" w:cs="Times New Roman"/>
+        </w:rPr>
+        <w:t>y propietarios particulares en Guatemala. Además, se explorará la posibilidad de colaboración con instituciones financieras y gubernamentales, para proporcionar información sobre financiamiento hipotecario y otros servicios.</w:t>
+      </w:r>
+    </w:p>
+    <w:p>
+      <w:pPr>
+        <w:spacing w:line="480" w:lineRule="auto"/>
+        <w:jc w:val="both"/>
+        <w:rPr>
+          <w:rFonts w:ascii="Times New Roman" w:hAnsi="Times New Roman" w:cs="Times New Roman"/>
+        </w:rPr>
+      </w:pPr>
+    </w:p>
+    <w:p>
+      <w:pPr>
+        <w:spacing w:line="480" w:lineRule="auto"/>
+        <w:jc w:val="both"/>
         <w:rPr>
           <w:rFonts w:ascii="Times New Roman" w:hAnsi="Times New Roman" w:cs="Times New Roman"/>
           <w:b/>
           <w:bCs/>
         </w:rPr>
-        <w:t>Institucional:</w:t>
-      </w:r>
-    </w:p>
-    <w:p>
-      <w:pPr>
-        <w:spacing w:line="480" w:lineRule="auto"/>
-        <w:jc w:val="both"/>
-        <w:rPr>
-          <w:rFonts w:ascii="Times New Roman" w:hAnsi="Times New Roman" w:cs="Times New Roman"/>
-        </w:rPr>
-      </w:pPr>
-      <w:r>
-        <w:rPr>
-          <w:rFonts w:ascii="Times New Roman" w:hAnsi="Times New Roman" w:cs="Times New Roman"/>
-        </w:rPr>
-        <w:t>Se trabajará en coordinación con agencias inmobiliarias</w:t>
-      </w:r>
-      <w:r>
-        <w:rPr>
-          <w:rFonts w:ascii="Times New Roman" w:hAnsi="Times New Roman" w:cs="Times New Roman"/>
-        </w:rPr>
-        <w:t xml:space="preserve"> </w:t>
-      </w:r>
-      <w:r>
-        <w:rPr>
-          <w:rFonts w:ascii="Times New Roman" w:hAnsi="Times New Roman" w:cs="Times New Roman"/>
-        </w:rPr>
-        <w:t>y propietarios particulares en Guatemala. Además, se explorará la posibilidad de colaboración con instituciones financieras y gubernamentales, para proporcionar información sobre financiamiento hipotecario y otros servicios.</w:t>
-      </w:r>
-    </w:p>
-    <w:p>
-      <w:pPr>
-        <w:spacing w:line="480" w:lineRule="auto"/>
-        <w:jc w:val="both"/>
-        <w:rPr>
-          <w:rFonts w:ascii="Times New Roman" w:hAnsi="Times New Roman" w:cs="Times New Roman"/>
-        </w:rPr>
-      </w:pPr>
-    </w:p>
-    <w:p>
-      <w:pPr>
-        <w:spacing w:line="480" w:lineRule="auto"/>
-        <w:jc w:val="both"/>
+      </w:pPr>
+      <w:r>
         <w:rPr>
           <w:rFonts w:ascii="Times New Roman" w:hAnsi="Times New Roman" w:cs="Times New Roman"/>
           <w:b/>
           <w:bCs/>
         </w:rPr>
-      </w:pPr>
-      <w:r>
+        <w:t xml:space="preserve">Personal: </w:t>
+      </w:r>
+    </w:p>
+    <w:p>
+      <w:pPr>
+        <w:spacing w:line="480" w:lineRule="auto"/>
+        <w:jc w:val="both"/>
+        <w:rPr>
+          <w:rFonts w:ascii="Times New Roman" w:hAnsi="Times New Roman" w:cs="Times New Roman"/>
+        </w:rPr>
+      </w:pPr>
+      <w:r>
+        <w:rPr>
+          <w:rFonts w:ascii="Times New Roman" w:hAnsi="Times New Roman" w:cs="Times New Roman"/>
+        </w:rPr>
+        <w:t>La plataforma estará dirigida a compradores, vendedores, agentes inmobiliarios y administradores de propiedades que deseen optimizar sus procesos de compraventa y alquiler.</w:t>
+      </w:r>
+    </w:p>
+    <w:p>
+      <w:pPr>
+        <w:spacing w:line="480" w:lineRule="auto"/>
+        <w:jc w:val="both"/>
+        <w:rPr>
+          <w:rFonts w:ascii="Times New Roman" w:hAnsi="Times New Roman" w:cs="Times New Roman"/>
+        </w:rPr>
+      </w:pPr>
+    </w:p>
+    <w:p>
+      <w:pPr>
+        <w:spacing w:line="480" w:lineRule="auto"/>
+        <w:jc w:val="both"/>
         <w:rPr>
           <w:rFonts w:ascii="Times New Roman" w:hAnsi="Times New Roman" w:cs="Times New Roman"/>
           <w:b/>
           <w:bCs/>
         </w:rPr>
-        <w:t xml:space="preserve">Personal: </w:t>
-      </w:r>
-    </w:p>
-    <w:p>
-      <w:pPr>
-        <w:spacing w:line="480" w:lineRule="auto"/>
-        <w:jc w:val="both"/>
-        <w:rPr>
-          <w:rFonts w:ascii="Times New Roman" w:hAnsi="Times New Roman" w:cs="Times New Roman"/>
-        </w:rPr>
-      </w:pPr>
-      <w:r>
-        <w:rPr>
-          <w:rFonts w:ascii="Times New Roman" w:hAnsi="Times New Roman" w:cs="Times New Roman"/>
-        </w:rPr>
-        <w:t>La plataforma estará dirigida a compradores, vendedores, agentes inmobiliarios y administradores de propiedades que deseen optimizar sus procesos de compraventa y alquiler.</w:t>
-      </w:r>
-    </w:p>
-    <w:p>
-      <w:pPr>
-        <w:spacing w:line="480" w:lineRule="auto"/>
-        <w:jc w:val="both"/>
-        <w:rPr>
-          <w:rFonts w:ascii="Times New Roman" w:hAnsi="Times New Roman" w:cs="Times New Roman"/>
-        </w:rPr>
-      </w:pPr>
-    </w:p>
-    <w:p>
-      <w:pPr>
-        <w:spacing w:line="480" w:lineRule="auto"/>
-        <w:jc w:val="both"/>
+      </w:pPr>
+      <w:r>
         <w:rPr>
           <w:rFonts w:ascii="Times New Roman" w:hAnsi="Times New Roman" w:cs="Times New Roman"/>
           <w:b/>
           <w:bCs/>
         </w:rPr>
-      </w:pPr>
-      <w:r>
+        <w:t>Temporal:</w:t>
+      </w:r>
+    </w:p>
+    <w:p>
+      <w:pPr>
+        <w:spacing w:line="480" w:lineRule="auto"/>
+        <w:jc w:val="both"/>
+        <w:rPr>
+          <w:rFonts w:ascii="Times New Roman" w:hAnsi="Times New Roman" w:cs="Times New Roman"/>
+        </w:rPr>
+      </w:pPr>
+      <w:r>
+        <w:rPr>
+          <w:rFonts w:ascii="Times New Roman" w:hAnsi="Times New Roman" w:cs="Times New Roman"/>
+        </w:rPr>
+        <w:lastRenderedPageBreak/>
+        <w:t xml:space="preserve">El desarrollo, prueba e implementación tendrá un plazo de </w:t>
+      </w:r>
+      <w:r>
+        <w:rPr>
+          <w:rFonts w:ascii="Times New Roman" w:hAnsi="Times New Roman" w:cs="Times New Roman"/>
+        </w:rPr>
+        <w:t>10</w:t>
+      </w:r>
+      <w:r>
+        <w:rPr>
+          <w:rFonts w:ascii="Times New Roman" w:hAnsi="Times New Roman" w:cs="Times New Roman"/>
+        </w:rPr>
+        <w:t xml:space="preserve"> meses</w:t>
+      </w:r>
+      <w:r>
+        <w:rPr>
+          <w:rFonts w:ascii="Times New Roman" w:hAnsi="Times New Roman" w:cs="Times New Roman"/>
+        </w:rPr>
+        <w:t>.</w:t>
+      </w:r>
+      <w:r>
+        <w:rPr>
+          <w:rFonts w:ascii="Times New Roman" w:hAnsi="Times New Roman" w:cs="Times New Roman"/>
+        </w:rPr>
+        <w:t xml:space="preserve"> (</w:t>
+      </w:r>
+      <w:r>
+        <w:rPr>
+          <w:rFonts w:ascii="Times New Roman" w:hAnsi="Times New Roman" w:cs="Times New Roman"/>
+        </w:rPr>
+        <w:t>febrero</w:t>
+      </w:r>
+      <w:r>
+        <w:rPr>
+          <w:rFonts w:ascii="Times New Roman" w:hAnsi="Times New Roman" w:cs="Times New Roman"/>
+        </w:rPr>
+        <w:t xml:space="preserve"> 2025 – </w:t>
+      </w:r>
+      <w:r>
+        <w:rPr>
+          <w:rFonts w:ascii="Times New Roman" w:hAnsi="Times New Roman" w:cs="Times New Roman"/>
+        </w:rPr>
+        <w:t>noviembre</w:t>
+      </w:r>
+      <w:r>
+        <w:rPr>
+          <w:rFonts w:ascii="Times New Roman" w:hAnsi="Times New Roman" w:cs="Times New Roman"/>
+        </w:rPr>
+        <w:t xml:space="preserve"> 2025)</w:t>
+      </w:r>
+    </w:p>
+    <w:p>
+      <w:pPr>
+        <w:spacing w:line="480" w:lineRule="auto"/>
+        <w:jc w:val="both"/>
+        <w:rPr>
+          <w:rFonts w:ascii="Times New Roman" w:hAnsi="Times New Roman" w:cs="Times New Roman"/>
+        </w:rPr>
+      </w:pPr>
+    </w:p>
+    <w:p>
+      <w:pPr>
+        <w:spacing w:line="480" w:lineRule="auto"/>
+        <w:jc w:val="both"/>
         <w:rPr>
           <w:rFonts w:ascii="Times New Roman" w:hAnsi="Times New Roman" w:cs="Times New Roman"/>
           <w:b/>
           <w:bCs/>
         </w:rPr>
-        <w:lastRenderedPageBreak/>
-        <w:t>Temporal:</w:t>
-      </w:r>
-    </w:p>
-    <w:p>
-      <w:pPr>
-        <w:spacing w:line="480" w:lineRule="auto"/>
-        <w:jc w:val="both"/>
-        <w:rPr>
-          <w:rFonts w:ascii="Times New Roman" w:hAnsi="Times New Roman" w:cs="Times New Roman"/>
-        </w:rPr>
-      </w:pPr>
-      <w:r>
-        <w:rPr>
-          <w:rFonts w:ascii="Times New Roman" w:hAnsi="Times New Roman" w:cs="Times New Roman"/>
-        </w:rPr>
-        <w:t xml:space="preserve">El desarrollo, prueba e implementación tendrá un plazo de </w:t>
-      </w:r>
-      <w:r>
-        <w:rPr>
-          <w:rFonts w:ascii="Times New Roman" w:hAnsi="Times New Roman" w:cs="Times New Roman"/>
-        </w:rPr>
-        <w:t>10</w:t>
-      </w:r>
-      <w:r>
-        <w:rPr>
-          <w:rFonts w:ascii="Times New Roman" w:hAnsi="Times New Roman" w:cs="Times New Roman"/>
-        </w:rPr>
-        <w:t xml:space="preserve"> meses</w:t>
-      </w:r>
-      <w:r>
-        <w:rPr>
-          <w:rFonts w:ascii="Times New Roman" w:hAnsi="Times New Roman" w:cs="Times New Roman"/>
-        </w:rPr>
-        <w:t>.</w:t>
-      </w:r>
-      <w:r>
-        <w:rPr>
-          <w:rFonts w:ascii="Times New Roman" w:hAnsi="Times New Roman" w:cs="Times New Roman"/>
-        </w:rPr>
-        <w:t xml:space="preserve"> (</w:t>
-      </w:r>
-      <w:r>
-        <w:rPr>
-          <w:rFonts w:ascii="Times New Roman" w:hAnsi="Times New Roman" w:cs="Times New Roman"/>
-        </w:rPr>
-        <w:t>febrero</w:t>
-      </w:r>
-      <w:r>
-        <w:rPr>
-          <w:rFonts w:ascii="Times New Roman" w:hAnsi="Times New Roman" w:cs="Times New Roman"/>
-        </w:rPr>
-        <w:t xml:space="preserve"> 2025 – </w:t>
-      </w:r>
-      <w:r>
-        <w:rPr>
-          <w:rFonts w:ascii="Times New Roman" w:hAnsi="Times New Roman" w:cs="Times New Roman"/>
-        </w:rPr>
-        <w:t>noviembre</w:t>
-      </w:r>
-      <w:r>
-        <w:rPr>
-          <w:rFonts w:ascii="Times New Roman" w:hAnsi="Times New Roman" w:cs="Times New Roman"/>
-        </w:rPr>
-        <w:t xml:space="preserve"> 2025)</w:t>
-      </w:r>
-    </w:p>
-    <w:p>
-      <w:pPr>
-        <w:spacing w:line="480" w:lineRule="auto"/>
-        <w:jc w:val="both"/>
-        <w:rPr>
-          <w:rFonts w:ascii="Times New Roman" w:hAnsi="Times New Roman" w:cs="Times New Roman"/>
-        </w:rPr>
-      </w:pPr>
-    </w:p>
-    <w:p>
-      <w:pPr>
-        <w:spacing w:line="480" w:lineRule="auto"/>
-        <w:jc w:val="both"/>
+      </w:pPr>
+      <w:r>
         <w:rPr>
           <w:rFonts w:ascii="Times New Roman" w:hAnsi="Times New Roman" w:cs="Times New Roman"/>
           <w:b/>
           <w:bCs/>
         </w:rPr>
-      </w:pPr>
-      <w:r>
+        <w:t>Temático:</w:t>
+      </w:r>
+    </w:p>
+    <w:p>
+      <w:pPr>
+        <w:spacing w:line="480" w:lineRule="auto"/>
+        <w:jc w:val="both"/>
+        <w:rPr>
+          <w:rFonts w:ascii="Times New Roman" w:hAnsi="Times New Roman" w:cs="Times New Roman"/>
+        </w:rPr>
+      </w:pPr>
+      <w:r>
+        <w:rPr>
+          <w:rFonts w:ascii="Times New Roman" w:hAnsi="Times New Roman" w:cs="Times New Roman"/>
+        </w:rPr>
+        <w:t>El proyecto se enfocará en la digitalización y modernización del mercado inmobiliario mediante el desarrollo de una aplicación web que facilite la publicación, búsqueda y gestión de propiedades en venta o alquiler.</w:t>
+      </w:r>
+    </w:p>
+    <w:p>
+      <w:pPr>
+        <w:spacing w:line="480" w:lineRule="auto"/>
+        <w:jc w:val="both"/>
+        <w:rPr>
+          <w:rFonts w:ascii="Times New Roman" w:hAnsi="Times New Roman" w:cs="Times New Roman"/>
+        </w:rPr>
+      </w:pPr>
+    </w:p>
+    <w:p>
+      <w:pPr>
+        <w:spacing w:line="480" w:lineRule="auto"/>
+        <w:jc w:val="both"/>
+        <w:rPr>
+          <w:rFonts w:ascii="Times New Roman" w:hAnsi="Times New Roman" w:cs="Times New Roman"/>
+        </w:rPr>
+      </w:pPr>
+    </w:p>
+    <w:p>
+      <w:pPr>
+        <w:spacing w:line="480" w:lineRule="auto"/>
+        <w:jc w:val="center"/>
         <w:rPr>
           <w:rFonts w:ascii="Times New Roman" w:hAnsi="Times New Roman" w:cs="Times New Roman"/>
           <w:b/>
           <w:bCs/>
         </w:rPr>
-        <w:t>Temático:</w:t>
-      </w:r>
-    </w:p>
-    <w:p>
-      <w:pPr>
-        <w:spacing w:line="480" w:lineRule="auto"/>
-        <w:jc w:val="both"/>
-        <w:rPr>
-          <w:rFonts w:ascii="Times New Roman" w:hAnsi="Times New Roman" w:cs="Times New Roman"/>
-        </w:rPr>
-      </w:pPr>
-      <w:r>
-        <w:rPr>
-          <w:rFonts w:ascii="Times New Roman" w:hAnsi="Times New Roman" w:cs="Times New Roman"/>
-        </w:rPr>
-        <w:t>El proyecto se enfocará en la digitalización y modernización del mercado inmobiliario mediante el desarrollo de una aplicación web que facilite la publicación, búsqueda y gestión de propiedades en venta o alquiler.</w:t>
-      </w:r>
-    </w:p>
-    <w:p>
-      <w:pPr>
-        <w:spacing w:line="480" w:lineRule="auto"/>
-        <w:jc w:val="both"/>
-        <w:rPr>
-          <w:rFonts w:ascii="Times New Roman" w:hAnsi="Times New Roman" w:cs="Times New Roman"/>
-        </w:rPr>
-      </w:pPr>
-    </w:p>
-    <w:p>
-      <w:pPr>
-        <w:spacing w:line="480" w:lineRule="auto"/>
-        <w:jc w:val="both"/>
-        <w:rPr>
-          <w:rFonts w:ascii="Times New Roman" w:hAnsi="Times New Roman" w:cs="Times New Roman"/>
-        </w:rPr>
-      </w:pPr>
-    </w:p>
-    <w:p>
-      <w:pPr>
-        <w:spacing w:line="480" w:lineRule="auto"/>
-        <w:jc w:val="center"/>
+      </w:pPr>
+      <w:r>
         <w:rPr>
           <w:rFonts w:ascii="Times New Roman" w:hAnsi="Times New Roman" w:cs="Times New Roman"/>
           <w:b/>
           <w:bCs/>
         </w:rPr>
-      </w:pPr>
-      <w:r>
+        <w:t>Alcances B</w:t>
+      </w:r>
+    </w:p>
+    <w:p>
+      <w:pPr>
+        <w:spacing w:line="480" w:lineRule="auto"/>
+        <w:jc w:val="both"/>
         <w:rPr>
           <w:rFonts w:ascii="Times New Roman" w:hAnsi="Times New Roman" w:cs="Times New Roman"/>
           <w:b/>
           <w:bCs/>
         </w:rPr>
-        <w:t>Alcances B</w:t>
-      </w:r>
-    </w:p>
-    <w:p>
-      <w:pPr>
-        <w:spacing w:line="480" w:lineRule="auto"/>
-        <w:jc w:val="both"/>
+      </w:pPr>
+      <w:r>
         <w:rPr>
           <w:rFonts w:ascii="Times New Roman" w:hAnsi="Times New Roman" w:cs="Times New Roman"/>
           <w:b/>
           <w:bCs/>
         </w:rPr>
-      </w:pPr>
-      <w:r>
+        <w:t>Tecnológico</w:t>
+      </w:r>
+    </w:p>
+    <w:p>
+      <w:pPr>
+        <w:spacing w:line="480" w:lineRule="auto"/>
+        <w:jc w:val="both"/>
+        <w:rPr>
+          <w:rFonts w:ascii="Times New Roman" w:hAnsi="Times New Roman" w:cs="Times New Roman"/>
+        </w:rPr>
+      </w:pPr>
+      <w:r>
+        <w:rPr>
+          <w:rFonts w:ascii="Times New Roman" w:hAnsi="Times New Roman" w:cs="Times New Roman"/>
+        </w:rPr>
+        <w:t>La plataforma será desarrollada como una aplicación web,</w:t>
+      </w:r>
+      <w:r>
+        <w:rPr>
+          <w:rFonts w:ascii="Times New Roman" w:hAnsi="Times New Roman" w:cs="Times New Roman"/>
+        </w:rPr>
+        <w:t xml:space="preserve"> que será</w:t>
+      </w:r>
+      <w:r>
+        <w:rPr>
+          <w:rFonts w:ascii="Times New Roman" w:hAnsi="Times New Roman" w:cs="Times New Roman"/>
+        </w:rPr>
+        <w:t xml:space="preserve"> accesible desde computadoras, tabletas y teléfonos móviles. Se utilizarán tecnologías como HTML5, CSS, JavaScript para el frontend, y PHP con MySQL para el backend. El sistema integrará funcionalidades como la publicación y gestión de propiedades, filtros de búsqueda avanzados, mensajería entre usuarios, autenticación segura, y validación de anuncios. Se garantizará un diseño escalable, seguro y optimizado para ofrecer un rendimiento eficiente y una experiencia de usuario fluida.</w:t>
+      </w:r>
+    </w:p>
+    <w:p>
+      <w:pPr>
+        <w:spacing w:line="480" w:lineRule="auto"/>
+        <w:jc w:val="both"/>
         <w:rPr>
           <w:rFonts w:ascii="Times New Roman" w:hAnsi="Times New Roman" w:cs="Times New Roman"/>
           <w:b/>
           <w:bCs/>
         </w:rPr>
-        <w:t>Tecnológico</w:t>
-      </w:r>
-    </w:p>
-    <w:p>
-      <w:pPr>
-        <w:numPr>
-          <w:ilvl w:val="0"/>
-          <w:numId w:val="18"/>
-        </w:numPr>
-        <w:spacing w:line="480" w:lineRule="auto"/>
-        <w:jc w:val="both"/>
-        <w:rPr>
-          <w:rFonts w:ascii="Times New Roman" w:hAnsi="Times New Roman" w:cs="Times New Roman"/>
-        </w:rPr>
       </w:pPr>
       <w:r>
         <w:rPr>
@@ -1782,53 +1739,157 @@
           <w:b/>
           <w:bCs/>
         </w:rPr>
-        <w:t>Plataforma web responsiva:</w:t>
-      </w:r>
-      <w:r>
-        <w:rPr>
-          <w:rFonts w:ascii="Times New Roman" w:hAnsi="Times New Roman" w:cs="Times New Roman"/>
-        </w:rPr>
-        <w:t xml:space="preserve"> La aplicación será accesible desde computadoras, tabletas y dispositivos móviles, optimizando la experiencia del usuario en distintos entornos digitales.</w:t>
-      </w:r>
-    </w:p>
-    <w:p>
-      <w:pPr>
-        <w:numPr>
-          <w:ilvl w:val="0"/>
-          <w:numId w:val="18"/>
-        </w:numPr>
-        <w:spacing w:line="480" w:lineRule="auto"/>
-        <w:jc w:val="both"/>
-        <w:rPr>
-          <w:rFonts w:ascii="Times New Roman" w:hAnsi="Times New Roman" w:cs="Times New Roman"/>
-        </w:rPr>
-      </w:pPr>
-      <w:r>
+        <w:t>Administrativo</w:t>
+      </w:r>
+    </w:p>
+    <w:p>
+      <w:pPr>
+        <w:spacing w:line="480" w:lineRule="auto"/>
+        <w:jc w:val="both"/>
+        <w:rPr>
+          <w:rFonts w:ascii="Times New Roman" w:hAnsi="Times New Roman" w:cs="Times New Roman"/>
+        </w:rPr>
+      </w:pPr>
+      <w:r>
+        <w:rPr>
+          <w:rFonts w:ascii="Times New Roman" w:hAnsi="Times New Roman" w:cs="Times New Roman"/>
+        </w:rPr>
+        <w:t>La plataforma contará con una estructura organizada para la gestión de usuarios, permitiendo la creación de distintos roles, como compradores, vendedores, agentes inmobiliarios y administradores del sistema.</w:t>
+      </w:r>
+      <w:r>
+        <w:rPr>
+          <w:rFonts w:ascii="Times New Roman" w:hAnsi="Times New Roman" w:cs="Times New Roman"/>
+        </w:rPr>
+        <w:t xml:space="preserve"> Los compradores p</w:t>
+      </w:r>
+      <w:r>
+        <w:rPr>
+          <w:rFonts w:ascii="Times New Roman" w:hAnsi="Times New Roman" w:cs="Times New Roman"/>
+        </w:rPr>
+        <w:t>odrán buscar propiedades, guardar favoritos</w:t>
+      </w:r>
+      <w:r>
+        <w:rPr>
+          <w:rFonts w:ascii="Times New Roman" w:hAnsi="Times New Roman" w:cs="Times New Roman"/>
+        </w:rPr>
+        <w:t xml:space="preserve"> y </w:t>
+      </w:r>
+      <w:r>
+        <w:rPr>
+          <w:rFonts w:ascii="Times New Roman" w:hAnsi="Times New Roman" w:cs="Times New Roman"/>
+        </w:rPr>
+        <w:lastRenderedPageBreak/>
+        <w:t>contactar vendedores</w:t>
+      </w:r>
+      <w:r>
+        <w:rPr>
+          <w:rFonts w:ascii="Times New Roman" w:hAnsi="Times New Roman" w:cs="Times New Roman"/>
+        </w:rPr>
+        <w:t xml:space="preserve"> </w:t>
+      </w:r>
+      <w:r>
+        <w:rPr>
+          <w:rFonts w:ascii="Times New Roman" w:hAnsi="Times New Roman" w:cs="Times New Roman"/>
+        </w:rPr>
+        <w:t>agentes.</w:t>
+      </w:r>
+      <w:r>
+        <w:rPr>
+          <w:rFonts w:ascii="Times New Roman" w:hAnsi="Times New Roman" w:cs="Times New Roman"/>
+        </w:rPr>
+        <w:t xml:space="preserve"> Los vendedores p</w:t>
+      </w:r>
+      <w:r>
+        <w:rPr>
+          <w:rFonts w:ascii="Times New Roman" w:hAnsi="Times New Roman" w:cs="Times New Roman"/>
+        </w:rPr>
+        <w:t>odrán publicar propiedades, editar sus anuncios, responder consultas y gestionar el estado de sus publicaciones.</w:t>
+      </w:r>
+      <w:r>
+        <w:rPr>
+          <w:rFonts w:ascii="Times New Roman" w:hAnsi="Times New Roman" w:cs="Times New Roman"/>
+        </w:rPr>
+        <w:t xml:space="preserve"> Los agentes inmobiliarios t</w:t>
+      </w:r>
+      <w:r>
+        <w:rPr>
+          <w:rFonts w:ascii="Times New Roman" w:hAnsi="Times New Roman" w:cs="Times New Roman"/>
+        </w:rPr>
+        <w:t>endrán acceso a herramientas profesionales para gestionar múltiples propiedades, destacar anuncios,</w:t>
+      </w:r>
+      <w:r>
+        <w:rPr>
+          <w:rFonts w:ascii="Times New Roman" w:hAnsi="Times New Roman" w:cs="Times New Roman"/>
+        </w:rPr>
+        <w:t xml:space="preserve"> </w:t>
+      </w:r>
+      <w:r>
+        <w:rPr>
+          <w:rFonts w:ascii="Times New Roman" w:hAnsi="Times New Roman" w:cs="Times New Roman"/>
+        </w:rPr>
+        <w:t>generar reportes de desempeño</w:t>
+      </w:r>
+      <w:r>
+        <w:rPr>
+          <w:rFonts w:ascii="Times New Roman" w:hAnsi="Times New Roman" w:cs="Times New Roman"/>
+        </w:rPr>
+        <w:t>.</w:t>
+      </w:r>
+      <w:r>
+        <w:rPr>
+          <w:rFonts w:ascii="Times New Roman" w:hAnsi="Times New Roman" w:cs="Times New Roman"/>
+        </w:rPr>
+        <w:t xml:space="preserve"> </w:t>
+      </w:r>
+      <w:r>
+        <w:rPr>
+          <w:rFonts w:ascii="Times New Roman" w:hAnsi="Times New Roman" w:cs="Times New Roman"/>
+        </w:rPr>
+        <w:t>P</w:t>
+      </w:r>
+      <w:r>
+        <w:rPr>
+          <w:rFonts w:ascii="Times New Roman" w:hAnsi="Times New Roman" w:cs="Times New Roman"/>
+        </w:rPr>
+        <w:t>or último</w:t>
+      </w:r>
+      <w:r>
+        <w:rPr>
+          <w:rFonts w:ascii="Times New Roman" w:hAnsi="Times New Roman" w:cs="Times New Roman"/>
+        </w:rPr>
+        <w:t xml:space="preserve"> </w:t>
+      </w:r>
+      <w:r>
+        <w:rPr>
+          <w:rFonts w:ascii="Times New Roman" w:hAnsi="Times New Roman" w:cs="Times New Roman"/>
+        </w:rPr>
+        <w:t>e</w:t>
+      </w:r>
+      <w:r>
+        <w:rPr>
+          <w:rFonts w:ascii="Times New Roman" w:hAnsi="Times New Roman" w:cs="Times New Roman"/>
+        </w:rPr>
+        <w:t>l administrador tendrá control sobre el contenido publicado, con la capacidad de supervisar, aprobar o eliminar publicaciones que no cumplan con los estándares establecidos.</w:t>
+      </w:r>
+    </w:p>
+    <w:p>
+      <w:pPr>
+        <w:spacing w:line="480" w:lineRule="auto"/>
+        <w:jc w:val="both"/>
+        <w:rPr>
+          <w:rFonts w:ascii="Times New Roman" w:hAnsi="Times New Roman" w:cs="Times New Roman"/>
+        </w:rPr>
+      </w:pPr>
+    </w:p>
+    <w:p>
+      <w:pPr>
+        <w:spacing w:line="480" w:lineRule="auto"/>
+        <w:jc w:val="both"/>
         <w:rPr>
           <w:rFonts w:ascii="Times New Roman" w:hAnsi="Times New Roman" w:cs="Times New Roman"/>
           <w:b/>
           <w:bCs/>
         </w:rPr>
-        <w:t>Filtros inteligentes de búsqueda:</w:t>
-      </w:r>
-      <w:r>
-        <w:rPr>
-          <w:rFonts w:ascii="Times New Roman" w:hAnsi="Times New Roman" w:cs="Times New Roman"/>
-        </w:rPr>
-        <w:t xml:space="preserve"> Implementación de un sistema avanzado de filtros que permita a los usuarios encontrar propiedades según ubicación, precio, tipo de inmueble, tamaño y características específicas.</w:t>
-      </w:r>
-    </w:p>
-    <w:p>
-      <w:pPr>
-        <w:numPr>
-          <w:ilvl w:val="0"/>
-          <w:numId w:val="18"/>
-        </w:numPr>
-        <w:spacing w:line="480" w:lineRule="auto"/>
-        <w:jc w:val="both"/>
-        <w:rPr>
-          <w:rFonts w:ascii="Times New Roman" w:hAnsi="Times New Roman" w:cs="Times New Roman"/>
-        </w:rPr>
       </w:pPr>
       <w:r>
         <w:rPr>
@@ -1836,165 +1897,6 @@
           <w:b/>
           <w:bCs/>
         </w:rPr>
-        <w:t>Sistema de autenticación segura:</w:t>
-      </w:r>
-      <w:r>
-        <w:rPr>
-          <w:rFonts w:ascii="Times New Roman" w:hAnsi="Times New Roman" w:cs="Times New Roman"/>
-        </w:rPr>
-        <w:t xml:space="preserve"> Se utilizarán protocolos de seguridad como autenticación de dos factores (2FA) y encriptación de datos para garantizar la protección de la información de los usuarios.</w:t>
-      </w:r>
-    </w:p>
-    <w:p>
-      <w:pPr>
-        <w:numPr>
-          <w:ilvl w:val="0"/>
-          <w:numId w:val="18"/>
-        </w:numPr>
-        <w:spacing w:line="480" w:lineRule="auto"/>
-        <w:jc w:val="both"/>
-        <w:rPr>
-          <w:rFonts w:ascii="Times New Roman" w:hAnsi="Times New Roman" w:cs="Times New Roman"/>
-        </w:rPr>
-      </w:pPr>
-      <w:r>
-        <w:rPr>
-          <w:rFonts w:ascii="Times New Roman" w:hAnsi="Times New Roman" w:cs="Times New Roman"/>
-          <w:b/>
-          <w:bCs/>
-        </w:rPr>
-        <w:lastRenderedPageBreak/>
-        <w:t>Integración de mapas interactivos:</w:t>
-      </w:r>
-      <w:r>
-        <w:rPr>
-          <w:rFonts w:ascii="Times New Roman" w:hAnsi="Times New Roman" w:cs="Times New Roman"/>
-        </w:rPr>
-        <w:t xml:space="preserve"> Implementación de mapas que permitan a los usuarios visualizar la ubicación exacta de las propiedades en venta o alquiler.</w:t>
-      </w:r>
-    </w:p>
-    <w:p>
-      <w:pPr>
-        <w:numPr>
-          <w:ilvl w:val="0"/>
-          <w:numId w:val="18"/>
-        </w:numPr>
-        <w:spacing w:line="480" w:lineRule="auto"/>
-        <w:jc w:val="both"/>
-        <w:rPr>
-          <w:rFonts w:ascii="Times New Roman" w:hAnsi="Times New Roman" w:cs="Times New Roman"/>
-        </w:rPr>
-      </w:pPr>
-      <w:r>
-        <w:rPr>
-          <w:rFonts w:ascii="Times New Roman" w:hAnsi="Times New Roman" w:cs="Times New Roman"/>
-          <w:b/>
-          <w:bCs/>
-        </w:rPr>
-        <w:t>Notificaciones personalizadas:</w:t>
-      </w:r>
-      <w:r>
-        <w:rPr>
-          <w:rFonts w:ascii="Times New Roman" w:hAnsi="Times New Roman" w:cs="Times New Roman"/>
-        </w:rPr>
-        <w:t xml:space="preserve"> Envío de alertas sobre nuevas propiedades disponibles, cambios en precios y mensajes entre compradores y vendedores.</w:t>
-      </w:r>
-    </w:p>
-    <w:p>
-      <w:pPr>
-        <w:numPr>
-          <w:ilvl w:val="0"/>
-          <w:numId w:val="18"/>
-        </w:numPr>
-        <w:spacing w:line="480" w:lineRule="auto"/>
-        <w:jc w:val="both"/>
-        <w:rPr>
-          <w:rFonts w:ascii="Times New Roman" w:hAnsi="Times New Roman" w:cs="Times New Roman"/>
-        </w:rPr>
-      </w:pPr>
-      <w:r>
-        <w:rPr>
-          <w:rFonts w:ascii="Times New Roman" w:hAnsi="Times New Roman" w:cs="Times New Roman"/>
-          <w:b/>
-          <w:bCs/>
-        </w:rPr>
-        <w:t>Panel de administración:</w:t>
-      </w:r>
-      <w:r>
-        <w:rPr>
-          <w:rFonts w:ascii="Times New Roman" w:hAnsi="Times New Roman" w:cs="Times New Roman"/>
-        </w:rPr>
-        <w:t xml:space="preserve"> Desarrollo de un módulo de administración para agentes inmobiliarios y propietarios, permitiéndoles gestionar anuncios, responder consultas y monitorear el rendimiento de sus publicaciones.</w:t>
-      </w:r>
-    </w:p>
-    <w:p>
-      <w:pPr>
-        <w:spacing w:line="480" w:lineRule="auto"/>
-        <w:jc w:val="both"/>
-        <w:rPr>
-          <w:rFonts w:ascii="Times New Roman" w:hAnsi="Times New Roman" w:cs="Times New Roman"/>
-        </w:rPr>
-      </w:pPr>
-    </w:p>
-    <w:p>
-      <w:pPr>
-        <w:spacing w:line="480" w:lineRule="auto"/>
-        <w:jc w:val="both"/>
-        <w:rPr>
-          <w:rFonts w:ascii="Times New Roman" w:hAnsi="Times New Roman" w:cs="Times New Roman"/>
-          <w:b/>
-          <w:bCs/>
-        </w:rPr>
-      </w:pPr>
-      <w:r>
-        <w:rPr>
-          <w:rFonts w:ascii="Times New Roman" w:hAnsi="Times New Roman" w:cs="Times New Roman"/>
-          <w:b/>
-          <w:bCs/>
-        </w:rPr>
-        <w:t>Administrativo</w:t>
-      </w:r>
-    </w:p>
-    <w:p>
-      <w:pPr>
-        <w:spacing w:line="480" w:lineRule="auto"/>
-        <w:jc w:val="both"/>
-        <w:rPr>
-          <w:rFonts w:ascii="Times New Roman" w:hAnsi="Times New Roman" w:cs="Times New Roman"/>
-        </w:rPr>
-      </w:pPr>
-      <w:r>
-        <w:rPr>
-          <w:rFonts w:ascii="Times New Roman" w:hAnsi="Times New Roman" w:cs="Times New Roman"/>
-        </w:rPr>
-        <w:t xml:space="preserve">La plataforma contará con una estructura organizada para la gestión de usuarios, permitiendo la creación de distintos roles, como compradores, vendedores, agentes inmobiliarios y administradores del sistema. El administrador tendrá control sobre el contenido publicado, con la capacidad de supervisar, aprobar o eliminar publicaciones que no cumplan con los estándares establecidos. </w:t>
-      </w:r>
-    </w:p>
-    <w:p>
-      <w:pPr>
-        <w:spacing w:line="480" w:lineRule="auto"/>
-        <w:jc w:val="both"/>
-        <w:rPr>
-          <w:rFonts w:ascii="Times New Roman" w:hAnsi="Times New Roman" w:cs="Times New Roman"/>
-        </w:rPr>
-      </w:pPr>
-    </w:p>
-    <w:p>
-      <w:pPr>
-        <w:spacing w:line="480" w:lineRule="auto"/>
-        <w:jc w:val="both"/>
-        <w:rPr>
-          <w:rFonts w:ascii="Times New Roman" w:hAnsi="Times New Roman" w:cs="Times New Roman"/>
-          <w:b/>
-          <w:bCs/>
-        </w:rPr>
-      </w:pPr>
-      <w:r>
-        <w:rPr>
-          <w:rFonts w:ascii="Times New Roman" w:hAnsi="Times New Roman" w:cs="Times New Roman"/>
-          <w:b/>
-          <w:bCs/>
-        </w:rPr>
         <w:t>Operacional</w:t>
       </w:r>
     </w:p>
@@ -2010,29 +1912,25 @@
         <w:rPr>
           <w:rFonts w:ascii="Times New Roman" w:hAnsi="Times New Roman" w:cs="Times New Roman"/>
         </w:rPr>
-        <w:t xml:space="preserve">La implementación de la plataforma se realizará de manera escalonada, iniciando con una fase de prueba que involucrará a un grupo de usuarios piloto antes de abrirla al público en general. Durante esta etapa, se brindará capacitación a los usuarios mediante guías y tutoriales que faciliten la comprensión del funcionamiento de la plataforma, especialmente orientado a vendedores y agentes inmobiliarios. Se establecerán procedimientos de monitoreo continuo y mantenimiento regular, </w:t>
-      </w:r>
-      <w:r>
-        <w:rPr>
-          <w:rFonts w:ascii="Times New Roman" w:hAnsi="Times New Roman" w:cs="Times New Roman"/>
-        </w:rPr>
-        <w:lastRenderedPageBreak/>
-        <w:t>con el fin de asegurar el buen rendimiento del sistema y su constante actualización en aspectos técnicos y de seguridad. Además, se diseñará una estrategia de crecimiento que incluya acciones de marketing digital y posicionamiento SEO para aumentar la visibilidad de la plataforma y consolidarla como una opción confiable dentro del mercado inmobiliario guatemalteco.</w:t>
-      </w:r>
-    </w:p>
-    <w:p>
-      <w:pPr>
-        <w:spacing w:line="480" w:lineRule="auto"/>
-        <w:jc w:val="both"/>
-        <w:rPr>
-          <w:rFonts w:ascii="Times New Roman" w:hAnsi="Times New Roman" w:cs="Times New Roman"/>
-        </w:rPr>
-      </w:pPr>
-      <w:r>
-        <w:rPr>
-          <w:rFonts w:ascii="Times New Roman" w:hAnsi="Times New Roman" w:cs="Times New Roman"/>
-        </w:rPr>
-        <w:t>Que funciones que se va a hacer con el sistema</w:t>
+        <w:t>A futuro, la plataforma estará orientada a mejorar la operatividad del mercado inmobiliario digital, permitiendo una gestión más eficiente de publicaciones y solicitudes de contacto entre usuarios. Los propietarios podrán monitorear en tiempo real el interés generado por sus propiedades, facilitando la organización de visitas o negociaciones. Asimismo, se espera que la plataforma optimice el proceso de búsqueda para los compradores o arrendatarios, brindándoles acceso inmediato a información detallada,</w:t>
+      </w:r>
+      <w:r>
+        <w:rPr>
+          <w:rFonts w:ascii="Times New Roman" w:hAnsi="Times New Roman" w:cs="Times New Roman"/>
+        </w:rPr>
+        <w:t xml:space="preserve"> </w:t>
+      </w:r>
+      <w:r>
+        <w:rPr>
+          <w:rFonts w:ascii="Times New Roman" w:hAnsi="Times New Roman" w:cs="Times New Roman"/>
+        </w:rPr>
+        <w:t>contribuyendo así a una experiencia más ágil, transparente y ordenada</w:t>
+      </w:r>
+      <w:r>
+        <w:rPr>
+          <w:rFonts w:ascii="Times New Roman" w:hAnsi="Times New Roman" w:cs="Times New Roman"/>
+        </w:rPr>
+        <w:t>.</w:t>
       </w:r>
     </w:p>
     <w:sectPr>

</xml_diff>